<commit_message>
Joshua 2nd in-depth re-review: 6 MSG restorations (patronymics + asymmetric KO-had-it gaps), docx rebuild, doc reupload verified 24/24
</commit_message>
<xml_diff>
--- a/gdocs_build/Joshua.docx
+++ b/gdocs_build/Joshua.docx
@@ -6104,7 +6104,7 @@
               <w:rPr>
                 <w:sz w:val="18"/>
               </w:rPr>
-              <w:t>Then Joshua, together with all of Israel, took Achan, the silver, the robe, the gold bar, his sons and daughters, his cattle, donkeys and sheep, his tent and everything he had, and brought them up to the Valley of Achor (which means 'Trouble').</w:t>
+              <w:t>Then Joshua, together with all of Israel, took Achan son of Zerah, the silver, the robe, the gold bar, his sons and daughters, his cattle, donkeys and sheep, his tent and everything he had, and brought them up to the Valley of Achor (which means 'Trouble').</w:t>
             </w:r>
           </w:p>
         </w:tc>
@@ -6127,7 +6127,7 @@
               <w:rPr>
                 <w:sz w:val="18"/>
               </w:rPr>
-              <w:t>그리고 여호수아는 모든 이스라엘 백성과 함께 아간과 그 은, 외투, 금덩이, 그리고 그의 아들딸, 소, 나귀, 양, 텐트랑 그에게 속한 모든 것을 데리고 아골 골짜기(‘괴로움의 골짜기’라는 뜻)로 올라갔어.</w:t>
+              <w:t>그리고 여호수아는 모든 이스라엘 백성과 함께 세라의 아들 아간과 그 은, 외투, 금덩이, 그리고 그의 아들딸, 소, 나귀, 양, 텐트랑 그에게 속한 모든 것을 데리고 아골 골짜기(‘괴로움의 골짜기’라는 뜻)로 올라갔어.</w:t>
             </w:r>
           </w:p>
         </w:tc>
@@ -11232,7 +11232,7 @@
               <w:rPr>
                 <w:sz w:val="18"/>
               </w:rPr>
-              <w:t>So Joshua took over the entire land: the mountains, the southern desert, all of Goshen, the foothills, the valley, and the mountains of Israel with their foothills. He conquered from Mount Halak, which overlooks Seir, all the way to Baal Gad in the Valley of Lebanon, in the shadow of Mount Hermon. He captured all their kings and executed them. Joshua was at war with these kings for a long time. Not a single town made a peace treaty with the Israelites, except for the Hivites in Gibeon. Israel had to fight for and conquer all the rest. It was actually God's plan for them to be stubborn and fight Israel, so they could be completely destroyed under the holy curse, without any mercy, just as God had commanded Moses.</w:t>
+              <w:t>So Joshua took over the entire land: the mountains, the southern desert, all of Goshen, the foothills, the valley (the Arabah), and the mountains of Israel with their foothills. He conquered from Mount Halak, which overlooks Seir, all the way to Baal Gad in the Valley of Lebanon, in the shadow of Mount Hermon. He captured all their kings and executed them. Joshua was at war with these kings for a long time. Not a single town made a peace treaty with the Israelites, except for the Hivites in Gibeon. Israel had to fight for and conquer all the rest. It was actually God's plan for them to be stubborn and fight Israel, so they could be completely destroyed under the holy curse, without any mercy, just as God had commanded Moses.</w:t>
             </w:r>
           </w:p>
         </w:tc>
@@ -11733,7 +11733,7 @@
               <w:rPr>
                 <w:sz w:val="18"/>
               </w:rPr>
-              <w:t>Then there was Og, the king of Bashan. This guy was one of the last of the Rephaim giants, for real. He ruled from Ashtaroth and Edrei, and his territory covered everything from Mount Hermon and Salecah, all of Bashan, right up to the border of the Geshurites and Maacathites—which was the other half of Gilead—and then to the border of King Sihon's land.</w:t>
+              <w:t>Then there was Og, the king of Bashan. This guy was one of the last of the Rephaim giants, for real. He ruled from Ashtaroth and Edrei, and his territory covered everything from Mount Hermon and Salecah, all of Bashan, right up to the border of the Geshurites and Maacathites—which was the other half of Gilead—and then to the border of Sihon, king of Heshbon.</w:t>
             </w:r>
           </w:p>
         </w:tc>
@@ -16218,7 +16218,7 @@
               <w:rPr>
                 <w:sz w:val="18"/>
               </w:rPr>
-              <w:t>Alright, so here's the breakdown of the land that went to the tribe of Manasseh, who was Joseph's firstborn son. Quick backstory: Gilead and Bashan were already given to Makir, Manasseh's oldest and a total beast in battle. So, the rest of the land was divided up among the other clans of Manasseh: Abiezer, Helek, Asriel, Shechem, Hepher, and Shemida. These were the main family lines of Manasseh, Joseph's son.</w:t>
+              <w:t>Alright, so here's the breakdown of the land that went to the tribe of Manasseh, who was Joseph's firstborn son. Quick backstory: Gilead and Bashan were already given to Makir, Manasseh's oldest, the father of Gilead, and a total beast in battle. So, the rest of the land was divided up among the other clans of Manasseh: Abiezer, Helek, Asriel, Shechem, Hepher, and Shemida. These were the main family lines of Manasseh, Joseph's son.</w:t>
             </w:r>
           </w:p>
         </w:tc>
@@ -23381,7 +23381,7 @@
               <w:rPr>
                 <w:sz w:val="18"/>
               </w:rPr>
-              <w:t>Priest Phinehas, son of Eleazar, said to them, “Okay, now we know for sure that God is with us, since you haven’t been disloyal to God in this. You’ve actually saved the people of Israel from God’s punishment.”</w:t>
+              <w:t>Priest Phinehas, son of Eleazar, said to Reuben, Gad, and Manasseh, “Okay, now we know for sure that God is with us, since you haven’t been disloyal to God in this. You’ve actually saved the people of Israel from God’s punishment.”</w:t>
             </w:r>
           </w:p>
         </w:tc>
@@ -23452,7 +23452,7 @@
               <w:rPr>
                 <w:sz w:val="18"/>
               </w:rPr>
-              <w:t>Then Phinehas and the chiefs left the Reubenites, Gadites, and the half-tribe of Manasseh in Gilead and went back to Canaan to give a full report to the People of Israel. They were happy with the report. The Israelites blessed God, and all the talk about attacking and destroying the land where the Reubenites and Gadites lived stopped.</w:t>
+              <w:t>Then Priest Phinehas, son of Eleazar, and the chiefs left the Reubenites, Gadites, and the half-tribe of Manasseh in Gilead and went back to Canaan to give a full report to the People of Israel. They were happy with the report. The Israelites blessed God, and all the talk about attacking and destroying the land where the Reubenites and Gadites lived stopped.</w:t>
             </w:r>
           </w:p>
         </w:tc>
@@ -23475,7 +23475,7 @@
               <w:rPr>
                 <w:sz w:val="18"/>
               </w:rPr>
-              <w:t>그러고 나서 제사장 비느하스와 지도자들은 길르앗에 있던 르우벤, 갓 지파와 므낫세 반 지파를 떠나 가나안 땅으로 돌아가서 이스라엘 백성들에게 모든 걸 보고했어. 사람들은 그 보고를 듣고 기뻐했대. 이스라엘 백성들은 하나님을 찬양했고, 르우벤과 갓 지파가 사는 땅을 공격해서 파괴하자는 말은 더 이상 나오지 않았어.</w:t>
+              <w:t>그러고 나서 제사장 엘르아살의 아들 비느하스와 지도자들은 길르앗에 있던 르우벤, 갓 지파와 므낫세 반 지파를 떠나 가나안 땅으로 돌아가서 이스라엘 백성들에게 모든 걸 보고했어. 사람들은 그 보고를 듣고 기뻐했대. 이스라엘 백성들은 하나님을 찬양했고, 르우벤과 갓 지파가 사는 땅을 공격해서 파괴하자는 말은 더 이상 나오지 않았어.</w:t>
             </w:r>
           </w:p>
         </w:tc>

</xml_diff>

<commit_message>
Joshua 배지 정밀화 (OT 전수조사): ch24 P11 '17-18'→'18' (EN+KO). 독스 24/24 export-back OK.
</commit_message>
<xml_diff>
--- a/gdocs_build/Joshua.docx
+++ b/gdocs_build/Joshua.docx
@@ -25141,7 +25141,7 @@
                 <w:b/>
                 <w:sz w:val="16"/>
               </w:rPr>
-              <w:t>17-18</w:t>
+              <w:t>18</w:t>
             </w:r>
           </w:p>
           <w:p>
@@ -25164,7 +25164,7 @@
                 <w:b/>
                 <w:sz w:val="16"/>
               </w:rPr>
-              <w:t>17-18</w:t>
+              <w:t>18</w:t>
             </w:r>
           </w:p>
           <w:p>
@@ -25187,7 +25187,7 @@
                 <w:b/>
                 <w:sz w:val="16"/>
               </w:rPr>
-              <w:t>17-18</w:t>
+              <w:t>18</w:t>
             </w:r>
           </w:p>
           <w:p>

</xml_diff>